<commit_message>
Update Week 3 and Week 4 reports with local execution results
</commit_message>
<xml_diff>
--- a/Week_3_Automated_Test_Script_Development_Report.docx
+++ b/Week_3_Automated_Test_Script_Development_Report.docx
@@ -187,15 +187,8 @@
             <w:vAlign w:val="center"/>
           </w:tcPr>
           <w:p>
-            <w:pPr>
-              <w:spacing w:after="20"/>
-            </w:pPr>
             <w:r>
-              <w:rPr>
-                <w:rFonts w:ascii="Aptos" w:hAnsi="Aptos"/>
-                <w:sz w:val="16"/>
-              </w:rPr>
-              <w:t>1.0 / Training deliverable</w:t>
+              <w:t>1.1 / Executed against local training simulation</w:t>
             </w:r>
           </w:p>
         </w:tc>
@@ -305,14 +298,7 @@
             <w:shd w:fill="EEF3F8"/>
           </w:tcPr>
           <w:p>
-            <w:pPr>
-              <w:spacing w:after="20"/>
-            </w:pPr>
             <w:r>
-              <w:rPr>
-                <w:rFonts w:ascii="Aptos" w:hAnsi="Aptos"/>
-                <w:sz w:val="16"/>
-              </w:rPr>
               <w:t>6 September 2026</w:t>
             </w:r>
           </w:p>
@@ -356,6 +342,28 @@
           </w:p>
         </w:tc>
       </w:tr>
+      <w:tr>
+        <w:tc>
+          <w:tcPr>
+            <w:tcW w:type="dxa" w:w="4997"/>
+          </w:tcPr>
+          <w:p>
+            <w:r>
+              <w:t>Execution capture</w:t>
+            </w:r>
+          </w:p>
+        </w:tc>
+        <w:tc>
+          <w:tcPr>
+            <w:tcW w:type="dxa" w:w="4997"/>
+          </w:tcPr>
+          <w:p>
+            <w:r>
+              <w:t>6 October 2026</w:t>
+            </w:r>
+          </w:p>
+        </w:tc>
+      </w:tr>
     </w:tbl>
     <w:p>
       <w:pPr>
@@ -372,7 +380,7 @@
     </w:p>
     <w:p>
       <w:r>
-        <w:t>No application build, live test environment, or real student data was supplied. The URLs, locators, credentials, expected behavior, and results in this report are documented assumptions for a training exercise. The scripts have not been executed against a portal and are not evidence of verified test results. Confirm the simulated application contract with a product owner and adapt it to an approved test environment before execution.</w:t>
+        <w:t>No company application build or live company test environment was supplied. The Selenium suite was executed against a local training portal created to match the documented routes and element IDs. The run verifies the scripts against that simulation only; it does not verify the behavior or quality of a company system.</w:t>
       </w:r>
     </w:p>
     <w:p>
@@ -1376,7 +1384,7 @@
         <w:spacing w:after="40"/>
       </w:pPr>
       <w:r>
-        <w:t>No test execution results are reported because no working application instance was supplied.</w:t>
+        <w:t>Execution record: On 6 October 2026, the trainee ran the suite against the local training portal at http://127.0.0.1:8000. All seven tests passed in 25.68 seconds. No failure screenshots were produced. These are local simulation results, not verified results from a company portal.</w:t>
       </w:r>
     </w:p>
     <w:p>

</xml_diff>